<commit_message>
update file docx and add terrafrom/monitoring.monitoringtf
</commit_message>
<xml_diff>
--- a/docs/Day1/Bao_Cao_Thuc_Nghiem_Ngay_1-CloudEvo_Benchmark.docx
+++ b/docs/Day1/Bao_Cao_Thuc_Nghiem_Ngay_1-CloudEvo_Benchmark.docx
@@ -443,7 +443,7 @@
                 <w:color w:val="0F172A"/>
                 <w:sz w:val="26"/>
               </w:rPr>
-              <w:t>$13.16</w:t>
+              <w:t>$15.21</w:t>
               <w:br/>
             </w:r>
             <w:r>
@@ -647,7 +647,7 @@
                 <w:color w:val="334155"/>
                 <w:sz w:val="19"/>
               </w:rPr>
-              <w:t>Nhóm bảo mật cloudevo-web-sg hoạt động ở cơ chế Stateful, gắn trực tiếp vào card mạng ảo ENI của máy chủ EC2. Việc giới hạn chặt chẽ chỉ mở Port 80 và Port 22 tuân thủ nguyên tắc đặc quyền tối thiểu (Least Privilege), ngăn chặn toàn bộ các nỗ lực quét cổng trái phép vào các dịch vụ nội bộ khác.</w:t>
+              <w:t>Nhóm bảo mật cloudevo-web-sg hoạt động ở cơ chế Stateful, gắn trực tiếp vào card mạng ảo ENI của máy chủ EC2. Chỉ mở Port 80 (HTTP) và Port 22 (SSH); mọi cổng khác bị chặn mặc định nên không thể quét vào các dịch vụ nội bộ khác. Lưu ý: SSH đang mở cho mọi địa chỉ (0.0.0.0/0) trong môi trường lab; trên Production nên giới hạn theo dải IP quản trị hoặc dùng AWS Systems Manager Session Manager.</w:t>
             </w:r>
           </w:p>
         </w:tc>
@@ -1218,7 +1218,7 @@
                 <w:color w:val="334155"/>
                 <w:sz w:val="17"/>
               </w:rPr>
-              <w:t>Tuyệt đối (Idempotent); có thể khởi tạo đồng loạt hàng chục máy chủ giống nhau với độ chính xác 100%.</w:t>
+              <w:t>Tái lập được (reproducible): cùng một script tạo ra các máy chủ có cấu hình giống nhau.</w:t>
             </w:r>
           </w:p>
         </w:tc>
@@ -1826,7 +1826,7 @@
                 <w:color w:val="334155"/>
                 <w:sz w:val="17"/>
               </w:rPr>
-              <w:t>$7.59 / tháng</w:t>
+              <w:t>$9.64 / tháng</w:t>
             </w:r>
           </w:p>
         </w:tc>
@@ -2212,7 +2212,7 @@
                 <w:color w:val="2563EB"/>
                 <w:sz w:val="17"/>
               </w:rPr>
-              <w:t>~$13.16 / tháng</w:t>
+              <w:t>~$15.21 / tháng</w:t>
             </w:r>
           </w:p>
         </w:tc>

</xml_diff>